<commit_message>
align lab1 report with template and screenshot evidence
</commit_message>
<xml_diff>
--- a/lab1/Lab1实验报告.docx
+++ b/lab1/Lab1实验报告.docx
@@ -1903,7 +1903,7 @@
         <w:rPr>
           <w:b/>
         </w:rPr>
-        <w:t>输入文本</w:t>
+        <w:t>文本文件中包含的内容</w:t>
       </w:r>
     </w:p>
     <w:p>
@@ -1932,47 +1932,28 @@
         <w:rPr>
           <w:b/>
         </w:rPr>
-        <w:t>期望结果</w:t>
-      </w:r>
-    </w:p>
-    <w:p>
-      <w:pPr>
-        <w:pStyle w:val="ListBullet"/>
-      </w:pPr>
-      <w:r>
-        <w:t>程序成功读取文本并建图；</w:t>
-      </w:r>
-    </w:p>
-    <w:p>
-      <w:pPr>
-        <w:pStyle w:val="ListBullet"/>
-      </w:pPr>
-      <w:r>
-        <w:t>结点数为 10；</w:t>
-      </w:r>
-    </w:p>
-    <w:p>
-      <w:pPr>
-        <w:pStyle w:val="ListBullet"/>
-      </w:pPr>
-      <w:r>
-        <w:t>边数为 12；</w:t>
-      </w:r>
-    </w:p>
-    <w:p>
-      <w:pPr>
-        <w:pStyle w:val="ListBullet"/>
-      </w:pPr>
-      <w:r>
-        <w:t>输出图像文件 `out/directed-graph.png`；</w:t>
-      </w:r>
-    </w:p>
-    <w:p>
-      <w:pPr>
-        <w:pStyle w:val="ListBullet"/>
-      </w:pPr>
-      <w:r>
-        <w:t>保留跨行相邻关系 `worlds -&gt; to`。</w:t>
+        <w:t>期望生成的图（手工分析）</w:t>
+      </w:r>
+    </w:p>
+    <w:p>
+      <w:r>
+        <w:t>应包含 10 个结点：</w:t>
+      </w:r>
+    </w:p>
+    <w:p>
+      <w:r>
+        <w:t>`to, explore, strange, new, worlds, seek, out, life, and, civilizations`</w:t>
+      </w:r>
+    </w:p>
+    <w:p/>
+    <w:p>
+      <w:r>
+        <w:t>应包含 12 条有向边：</w:t>
+      </w:r>
+    </w:p>
+    <w:p>
+      <w:r>
+        <w:t>`to-&gt;explore, explore-&gt;strange, strange-&gt;new, new-&gt;worlds, worlds-&gt;to, to-&gt;seek, seek-&gt;out, out-&gt;new, new-&gt;life, life-&gt;and, and-&gt;new, new-&gt;civilizations`</w:t>
       </w:r>
     </w:p>
     <w:p/>
@@ -1984,12 +1965,12 @@
         <w:rPr>
           <w:b/>
         </w:rPr>
-        <w:t>实际结果</w:t>
-      </w:r>
-    </w:p>
-    <w:p>
-      <w:r>
-        <w:t>我重新运行当前仓库主程序后，得到：</w:t>
+        <w:t>程序实际生成结果</w:t>
+      </w:r>
+    </w:p>
+    <w:p>
+      <w:r>
+        <w:t>实际运行输出：</w:t>
       </w:r>
     </w:p>
     <w:p/>
@@ -2035,12 +2016,56 @@
         <w:rPr>
           <w:b/>
         </w:rPr>
-        <w:t>结论</w:t>
-      </w:r>
-    </w:p>
-    <w:p>
-      <w:r>
-        <w:t>运行结果与预期一致，说明文本读取、规整化、建图和渲染功能均正确。</w:t>
+        <w:t>二者是否一致</w:t>
+      </w:r>
+    </w:p>
+    <w:p>
+      <w:r>
+        <w:t>一致。</w:t>
+      </w:r>
+    </w:p>
+    <w:p/>
+    <w:p>
+      <w:pPr>
+        <w:pStyle w:val="Heading4"/>
+      </w:pPr>
+      <w:r>
+        <w:rPr>
+          <w:b/>
+        </w:rPr>
+        <w:t>截图与证据</w:t>
+      </w:r>
+    </w:p>
+    <w:p>
+      <w:pPr>
+        <w:pStyle w:val="ListBullet"/>
+      </w:pPr>
+      <w:r>
+        <w:t>旧版程序运行截图：`screenshots/screenshot_graph_text.png`</w:t>
+      </w:r>
+    </w:p>
+    <w:p>
+      <w:pPr>
+        <w:pStyle w:val="ListBullet"/>
+      </w:pPr>
+      <w:r>
+        <w:t>本次重新运行输出文本：`screenshots/app_output_latest.txt`</w:t>
+      </w:r>
+    </w:p>
+    <w:p>
+      <w:pPr>
+        <w:pStyle w:val="ListBullet"/>
+      </w:pPr>
+      <w:r>
+        <w:t>本次重新导出的图像文件：`artifacts/directed-graph-latest.png`</w:t>
+      </w:r>
+    </w:p>
+    <w:p>
+      <w:pPr>
+        <w:pStyle w:val="ListBullet"/>
+      </w:pPr>
+      <w:r>
+        <w:t>仓库中的图像输出：`out/directed-graph.png`</w:t>
       </w:r>
     </w:p>
     <w:p/>
@@ -2085,7 +2110,7 @@
           </w:tcPr>
           <w:p>
             <w:r>
-              <w:t>输入</w:t>
+              <w:t>输入（2个单词）</w:t>
             </w:r>
           </w:p>
         </w:tc>
@@ -2115,7 +2140,7 @@
           </w:tcPr>
           <w:p>
             <w:r>
-              <w:t>是否正确</w:t>
+              <w:t>运行是否正确</w:t>
             </w:r>
           </w:p>
         </w:tc>
@@ -2332,7 +2357,35 @@
     <w:p/>
     <w:p>
       <w:r>
-        <w:t>说明：第 1—3 条来自 `BridgeWordServiceTest`，第 4 条来自 `BridgeIntegrationTest`。</w:t>
+        <w:t>说明：前 3 条来自仓库测试 `BridgeWordServiceTest`，第 4 条来自 `BridgeIntegrationTest`。</w:t>
+      </w:r>
+    </w:p>
+    <w:p/>
+    <w:p>
+      <w:pPr>
+        <w:pStyle w:val="Heading4"/>
+      </w:pPr>
+      <w:r>
+        <w:rPr>
+          <w:b/>
+        </w:rPr>
+        <w:t>截图与证据</w:t>
+      </w:r>
+    </w:p>
+    <w:p>
+      <w:pPr>
+        <w:pStyle w:val="ListBullet"/>
+      </w:pPr>
+      <w:r>
+        <w:t>旧版桥接词截图：`screenshots/screenshot_bridge.png`</w:t>
+      </w:r>
+    </w:p>
+    <w:p>
+      <w:pPr>
+        <w:pStyle w:val="ListBullet"/>
+      </w:pPr>
+      <w:r>
+        <w:t>本次重新运行输出文本：`screenshots/app_output_latest.txt`</w:t>
       </w:r>
     </w:p>
     <w:p/>
@@ -2377,7 +2430,7 @@
           </w:tcPr>
           <w:p>
             <w:r>
-              <w:t>输入</w:t>
+              <w:t>输入（一行文本）</w:t>
             </w:r>
           </w:p>
         </w:tc>
@@ -2407,7 +2460,7 @@
           </w:tcPr>
           <w:p>
             <w:r>
-              <w:t>是否正确</w:t>
+              <w:t>运行是否正确</w:t>
             </w:r>
           </w:p>
         </w:tc>
@@ -2520,7 +2573,19 @@
     <w:p/>
     <w:p>
       <w:r>
-        <w:t>说明：</w:t>
+        <w:t>说明：第 1 条来自仓库测试 `NewTextGeneratorTest` 和本次主程序真实运行；第 2 条用于说明无桥接词时仅做规整化输出。</w:t>
+      </w:r>
+    </w:p>
+    <w:p/>
+    <w:p>
+      <w:pPr>
+        <w:pStyle w:val="Heading4"/>
+      </w:pPr>
+      <w:r>
+        <w:rPr>
+          <w:b/>
+        </w:rPr>
+        <w:t>截图与证据</w:t>
       </w:r>
     </w:p>
     <w:p>
@@ -2528,7 +2593,7 @@
         <w:pStyle w:val="ListBullet"/>
       </w:pPr>
       <w:r>
-        <w:t>第 1 条来自 `NewTextGeneratorTest` 和当前主程序真实运行；</w:t>
+        <w:t>旧版新文本截图：`screenshots/screenshot_new_text.png`</w:t>
       </w:r>
     </w:p>
     <w:p>
@@ -2536,7 +2601,7 @@
         <w:pStyle w:val="ListBullet"/>
       </w:pPr>
       <w:r>
-        <w:t>第 2 条体现了无桥接词时仅做单词提取和小写规整化。</w:t>
+        <w:t>本次重新运行输出文本：`screenshots/app_output_latest.txt`</w:t>
       </w:r>
     </w:p>
     <w:p/>
@@ -2611,7 +2676,7 @@
           </w:tcPr>
           <w:p>
             <w:r>
-              <w:t>是否正确</w:t>
+              <w:t>运行是否正确</w:t>
             </w:r>
           </w:p>
         </w:tc>
@@ -2747,7 +2812,7 @@
           </w:tcPr>
           <w:p>
             <w:r>
-              <w:t>Shortest path from "to" to "civilizations": ... (length: 4)</w:t>
+              <w:t>Shortest path from "to" to "civilizations": to -&gt; explore -&gt; strange -&gt; new -&gt; civilizations (length: 4) 或另一条等长路径</w:t>
             </w:r>
           </w:p>
         </w:tc>
@@ -2776,7 +2841,19 @@
     <w:p/>
     <w:p>
       <w:r>
-        <w:t>说明：</w:t>
+        <w:t>说明：第 1 条来自 `ShortestPathServiceTest` 和 `ShortestPathIntegrationTest`，第 2 条来自 `ShortestPathServiceTest`，第 3 条来自本次主程序真实运行。</w:t>
+      </w:r>
+    </w:p>
+    <w:p/>
+    <w:p>
+      <w:pPr>
+        <w:pStyle w:val="Heading4"/>
+      </w:pPr>
+      <w:r>
+        <w:rPr>
+          <w:b/>
+        </w:rPr>
+        <w:t>截图与证据</w:t>
       </w:r>
     </w:p>
     <w:p>
@@ -2784,7 +2861,7 @@
         <w:pStyle w:val="ListBullet"/>
       </w:pPr>
       <w:r>
-        <w:t>第 1 条来自 `ShortestPathServiceTest` 与 `ShortestPathIntegrationTest`；</w:t>
+        <w:t>旧版最短路径截图：`screenshots/screenshot_shortest_path.png`</w:t>
       </w:r>
     </w:p>
     <w:p>
@@ -2792,15 +2869,7 @@
         <w:pStyle w:val="ListBullet"/>
       </w:pPr>
       <w:r>
-        <w:t>第 2 条来自 `ShortestPathServiceTest`；</w:t>
-      </w:r>
-    </w:p>
-    <w:p>
-      <w:pPr>
-        <w:pStyle w:val="ListBullet"/>
-      </w:pPr>
-      <w:r>
-        <w:t>第 3 条来自我对当前程序的真实运行。</w:t>
+        <w:t>本次重新运行输出文本：`screenshots/app_output_latest.txt`</w:t>
       </w:r>
     </w:p>
     <w:p/>
@@ -2845,7 +2914,7 @@
           </w:tcPr>
           <w:p>
             <w:r>
-              <w:t>输入</w:t>
+              <w:t>单词</w:t>
             </w:r>
           </w:p>
         </w:tc>
@@ -2875,7 +2944,7 @@
           </w:tcPr>
           <w:p>
             <w:r>
-              <w:t>是否正确</w:t>
+              <w:t>运行是否正确</w:t>
             </w:r>
           </w:p>
         </w:tc>
@@ -3040,7 +3109,35 @@
     <w:p/>
     <w:p>
       <w:r>
-        <w:t>说明：PageRank 部分不仅验证了普通结点分值，也验证了无出边结点场景下算法的正确性。</w:t>
+        <w:t>说明：第 1 条来自本次真实运行与 `PageRankServiceTest` / `PageRankIntegrationTest`，第 3 条说明仓库中已验证无出边结点情况。</w:t>
+      </w:r>
+    </w:p>
+    <w:p/>
+    <w:p>
+      <w:pPr>
+        <w:pStyle w:val="Heading4"/>
+      </w:pPr>
+      <w:r>
+        <w:rPr>
+          <w:b/>
+        </w:rPr>
+        <w:t>截图与证据</w:t>
+      </w:r>
+    </w:p>
+    <w:p>
+      <w:pPr>
+        <w:pStyle w:val="ListBullet"/>
+      </w:pPr>
+      <w:r>
+        <w:t>旧版 PageRank 截图：`screenshots/screenshot_pagerank.png`</w:t>
+      </w:r>
+    </w:p>
+    <w:p>
+      <w:pPr>
+        <w:pStyle w:val="ListBullet"/>
+      </w:pPr>
+      <w:r>
+        <w:t>本次重新运行输出文本：`screenshots/app_output_latest.txt`</w:t>
       </w:r>
     </w:p>
     <w:p/>
@@ -3057,7 +3154,7 @@
     </w:p>
     <w:p>
       <w:r>
-        <w:t>随机游走具有随机性，因此测试重点是“停止条件是否正确”和“是否写入文件”。</w:t>
+        <w:t>由于随机游走本身具有随机性，因此只要满足停止规则并能够写入文件，即可认为实现正确。</w:t>
       </w:r>
     </w:p>
     <w:p/>
@@ -3099,7 +3196,7 @@
           </w:tcPr>
           <w:p>
             <w:r>
-              <w:t>是否正确</w:t>
+              <w:t>程序运行是否正确</w:t>
             </w:r>
           </w:p>
         </w:tc>
@@ -3121,7 +3218,7 @@
           </w:tcPr>
           <w:p>
             <w:r>
-              <w:t>worlds to seek out new civilizations</w:t>
+              <w:t>seek out new worlds to seek</w:t>
             </w:r>
           </w:p>
         </w:tc>
@@ -3204,7 +3301,19 @@
     <w:p/>
     <w:p>
       <w:r>
-        <w:t>说明：</w:t>
+        <w:t>说明：第 1 条来自我本次重新运行程序得到的真实结果，已保存到 `artifacts/random-walk-latest.txt`；第 2、3 条来自 `RandomWalkServiceTest`。</w:t>
+      </w:r>
+    </w:p>
+    <w:p/>
+    <w:p>
+      <w:pPr>
+        <w:pStyle w:val="Heading4"/>
+      </w:pPr>
+      <w:r>
+        <w:rPr>
+          <w:b/>
+        </w:rPr>
+        <w:t>截图与证据</w:t>
       </w:r>
     </w:p>
     <w:p>
@@ -3212,7 +3321,7 @@
         <w:pStyle w:val="ListBullet"/>
       </w:pPr>
       <w:r>
-        <w:t>第 1 条来自我对当前程序的真实运行；</w:t>
+        <w:t>旧版随机游走截图：`screenshots/screenshot_random_walk.png`</w:t>
       </w:r>
     </w:p>
     <w:p>
@@ -3220,7 +3329,7 @@
         <w:pStyle w:val="ListBullet"/>
       </w:pPr>
       <w:r>
-        <w:t>第 2、3 条来自 `RandomWalkServiceTest`；</w:t>
+        <w:t>本次重新运行输出文本：`screenshots/app_output_latest.txt`</w:t>
       </w:r>
     </w:p>
     <w:p>
@@ -3228,7 +3337,15 @@
         <w:pStyle w:val="ListBullet"/>
       </w:pPr>
       <w:r>
-        <w:t>`RandomWalkIntegrationTest` 还验证了结果会同步写入文件。</w:t>
+        <w:t>本次随机游走结果文件：`artifacts/random-walk-latest.txt`</w:t>
+      </w:r>
+    </w:p>
+    <w:p>
+      <w:pPr>
+        <w:pStyle w:val="ListBullet"/>
+      </w:pPr>
+      <w:r>
+        <w:t>仓库中的随机游走结果：`out/random-walk.txt`</w:t>
       </w:r>
     </w:p>
     <w:p/>
@@ -4050,6 +4167,118 @@
     <w:p>
       <w:r>
         <w:t>虽然仓库中的主要证据以命令行日志和截图为主，但与 IDEA 工程结构结合后，可以证明该项目具备在 IDE 中使用 Git 的条件。</w:t>
+      </w:r>
+    </w:p>
+    <w:p/>
+    <w:p>
+      <w:pPr>
+        <w:pStyle w:val="Heading3"/>
+      </w:pPr>
+      <w:r>
+        <w:rPr>
+          <w:b/>
+        </w:rPr>
+        <w:t>8.5 Git 部分截图与证据汇总</w:t>
+      </w:r>
+    </w:p>
+    <w:p>
+      <w:r>
+        <w:t>为了与实验模板保持一致，Git 部分可直接引用以下截图与证据文件：</w:t>
+      </w:r>
+    </w:p>
+    <w:p/>
+    <w:p>
+      <w:pPr>
+        <w:pStyle w:val="ListBullet"/>
+      </w:pPr>
+      <w:r>
+        <w:t>仓库创建与首次提交：`screenshots/03_r2_first_commit.png`</w:t>
+      </w:r>
+    </w:p>
+    <w:p>
+      <w:pPr>
+        <w:pStyle w:val="ListBullet"/>
+      </w:pPr>
+      <w:r>
+        <w:t>第一次修改后 diff：`screenshots/04_r3_diff_after_first_edit.png`</w:t>
+      </w:r>
+    </w:p>
+    <w:p>
+      <w:pPr>
+        <w:pStyle w:val="ListBullet"/>
+      </w:pPr>
+      <w:r>
+        <w:t>撤销最后一次提交：`screenshots/07_r6_undo_last_commit.png`</w:t>
+      </w:r>
+    </w:p>
+    <w:p>
+      <w:pPr>
+        <w:pStyle w:val="ListBullet"/>
+      </w:pPr>
+      <w:r>
+        <w:t>配置远程仓库：`screenshots/10_r8_remote_setup.png`</w:t>
+      </w:r>
+    </w:p>
+    <w:p>
+      <w:pPr>
+        <w:pStyle w:val="ListBullet"/>
+      </w:pPr>
+      <w:r>
+        <w:t>推送 master 分支：`screenshots/11_r9_push_master.png`</w:t>
+      </w:r>
+    </w:p>
+    <w:p>
+      <w:pPr>
+        <w:pStyle w:val="ListBullet"/>
+      </w:pPr>
+      <w:r>
+        <w:t>合并 C4 到 B1：`screenshots/17_r6_merge_c4_into_b1.png`</w:t>
+      </w:r>
+    </w:p>
+    <w:p>
+      <w:pPr>
+        <w:pStyle w:val="ListBullet"/>
+      </w:pPr>
+      <w:r>
+        <w:t>分支合并状态：`screenshots/19_r8_branch_merge_status.png`</w:t>
+      </w:r>
+    </w:p>
+    <w:p>
+      <w:pPr>
+        <w:pStyle w:val="ListBullet"/>
+      </w:pPr>
+      <w:r>
+        <w:t>推送学号分支：`screenshots/21_r10_push_student_branch.png`</w:t>
+      </w:r>
+    </w:p>
+    <w:p>
+      <w:pPr>
+        <w:pStyle w:val="ListBullet"/>
+      </w:pPr>
+      <w:r>
+        <w:t>版本树截图：`screenshots/22_r11_version_tree.png`</w:t>
+      </w:r>
+    </w:p>
+    <w:p>
+      <w:pPr>
+        <w:pStyle w:val="ListBullet"/>
+      </w:pPr>
+      <w:r>
+        <w:t>GitHub 页面截图：`screenshots/github-2023112455.png`</w:t>
+      </w:r>
+    </w:p>
+    <w:p>
+      <w:pPr>
+        <w:pStyle w:val="ListBullet"/>
+      </w:pPr>
+      <w:r>
+        <w:t>Git 操作文字记录：`screenshots/git_evidence_record.md`</w:t>
+      </w:r>
+    </w:p>
+    <w:p/>
+    <w:p>
+      <w:r>
+        <w:t>这些材料都来自你仓库中已经保存的 `out/git-evidence` 目录，我已同步复制到本报告目录下，便于后续直接插入 Word。</w:t>
       </w:r>
     </w:p>
     <w:p/>

</xml_diff>